<commit_message>
fix: implement final delivery requirements, math/footnotes support, and robust path isolation
- Add native OMML math parsing and footnoting parts (footnotes.xml)
- Implement locked atomic publishing and safe path normalization
- Enforce strict shell section cleanup, font fallback propagation, and table bidi visual styles
- Add comprehensive finalize test suite and regenerate all 10 DOCX fixture outputs
</commit_message>
<xml_diff>
--- a/examples/sample_input.docx
+++ b/examples/sample_input.docx
@@ -10,13 +10,13 @@
         <w:bidiVisual/>
       </w:tblPr>
       <w:tblGrid>
-        <w:gridCol w:w="936"/>
-        <w:gridCol w:w="8702"/>
+        <w:gridCol w:w="1200"/>
+        <w:gridCol w:w="8438"/>
       </w:tblGrid>
       <w:tr>
         <w:tc>
           <w:tcPr>
-            <w:tcW w:type="dxa" w:w="936"/>
+            <w:tcW w:type="dxa" w:w="1200"/>
             <w:shd w:val="clear" w:color="auto" w:fill="6B2FA0"/>
             <w:tcMar>
               <w:top w:w="80" w:type="dxa"/>
@@ -34,6 +34,8 @@
           <w:p>
             <w:pPr>
               <w:jc w:val="center"/>
+              <w:keepNext/>
+              <w:keepLines/>
             </w:pPr>
             <w:r>
               <w:rPr>
@@ -44,7 +46,7 @@
                 <w:bCs/>
                 <w:color w:val="FFFFFF"/>
                 <w:lang w:val="en-US" w:bidi="fa-IR"/>
-                <w:rtl/>
+                <w:rtl w:val="1"/>
               </w:rPr>
               <w:t>۱.۵</w:t>
             </w:r>
@@ -52,7 +54,7 @@
         </w:tc>
         <w:tc>
           <w:tcPr>
-            <w:tcW w:type="dxa" w:w="8702"/>
+            <w:tcW w:type="dxa" w:w="8438"/>
             <w:tcMar>
               <w:top w:w="80" w:type="dxa"/>
               <w:bottom w:w="80" w:type="dxa"/>
@@ -68,8 +70,10 @@
           </w:tcPr>
           <w:p>
             <w:pPr>
-              <w:bidi/>
+              <w:bidi w:val="1"/>
               <w:jc w:val="start"/>
+              <w:keepNext/>
+              <w:keepLines/>
             </w:pPr>
             <w:r>
               <w:rPr>
@@ -92,6 +96,7 @@
                 <w:bCs/>
                 <w:color w:val="2D2D2D"/>
                 <w:lang w:val="en-US" w:bidi="fa-IR"/>
+                <w:rtl w:val="0"/>
               </w:rPr>
               <w:t>SQL Server</w:t>
             </w:r>
@@ -102,12 +107,13 @@
     <w:p>
       <w:pPr>
         <w:spacing w:before="0" w:after="120"/>
+        <w:keepNext/>
       </w:pPr>
       <w:r/>
     </w:p>
     <w:p>
       <w:pPr>
-        <w:bidi/>
+        <w:bidi w:val="1"/>
         <w:spacing w:line="336" w:lineRule="auto" w:after="120"/>
         <w:jc w:val="both"/>
       </w:pPr>
@@ -198,6 +204,7 @@
           <w:szCs w:val="22"/>
           <w:color w:val="2D2D2D"/>
           <w:lang w:val="en-US" w:bidi="fa-IR"/>
+          <w:rtl w:val="0"/>
         </w:rPr>
         <w:t>SQL</w:t>
       </w:r>
@@ -218,6 +225,7 @@
           <w:szCs w:val="22"/>
           <w:color w:val="2D2D2D"/>
           <w:lang w:val="en-US" w:bidi="fa-IR"/>
+          <w:rtl w:val="0"/>
         </w:rPr>
         <w:t>Server</w:t>
       </w:r>
@@ -348,6 +356,7 @@
           <w:szCs w:val="22"/>
           <w:color w:val="2D2D2D"/>
           <w:lang w:val="en-US" w:bidi="fa-IR"/>
+          <w:rtl w:val="0"/>
         </w:rPr>
         <w:t>SQL</w:t>
       </w:r>
@@ -368,6 +377,7 @@
           <w:szCs w:val="22"/>
           <w:color w:val="2D2D2D"/>
           <w:lang w:val="en-US" w:bidi="fa-IR"/>
+          <w:rtl w:val="0"/>
         </w:rPr>
         <w:t>Server</w:t>
       </w:r>
@@ -408,6 +418,7 @@
           <w:szCs w:val="22"/>
           <w:color w:val="2D2D2D"/>
           <w:lang w:val="en-US" w:bidi="fa-IR"/>
+          <w:rtl w:val="0"/>
         </w:rPr>
         <w:t>Database</w:t>
       </w:r>
@@ -428,6 +439,7 @@
           <w:szCs w:val="22"/>
           <w:color w:val="2D2D2D"/>
           <w:lang w:val="en-US" w:bidi="fa-IR"/>
+          <w:rtl w:val="0"/>
         </w:rPr>
         <w:t>Engine</w:t>
       </w:r>
@@ -468,6 +480,7 @@
           <w:szCs w:val="22"/>
           <w:color w:val="2D2D2D"/>
           <w:lang w:val="en-US" w:bidi="fa-IR"/>
+          <w:rtl w:val="0"/>
         </w:rPr>
         <w:t>SQL</w:t>
       </w:r>
@@ -488,6 +501,7 @@
           <w:szCs w:val="22"/>
           <w:color w:val="2D2D2D"/>
           <w:lang w:val="en-US" w:bidi="fa-IR"/>
+          <w:rtl w:val="0"/>
         </w:rPr>
         <w:t>Server</w:t>
       </w:r>
@@ -508,6 +522,7 @@
           <w:szCs w:val="22"/>
           <w:color w:val="2D2D2D"/>
           <w:lang w:val="en-US" w:bidi="fa-IR"/>
+          <w:rtl w:val="0"/>
         </w:rPr>
         <w:t>Agent.</w:t>
       </w:r>
@@ -688,6 +703,7 @@
           <w:szCs w:val="22"/>
           <w:color w:val="2D2D2D"/>
           <w:lang w:val="en-US" w:bidi="fa-IR"/>
+          <w:rtl w:val="0"/>
         </w:rPr>
         <w:t>Component</w:t>
       </w:r>
@@ -768,6 +784,7 @@
           <w:szCs w:val="22"/>
           <w:color w:val="2D2D2D"/>
           <w:lang w:val="en-US" w:bidi="fa-IR"/>
+          <w:rtl w:val="0"/>
         </w:rPr>
         <w:t>SQL</w:t>
       </w:r>
@@ -788,6 +805,7 @@
           <w:szCs w:val="22"/>
           <w:color w:val="2D2D2D"/>
           <w:lang w:val="en-US" w:bidi="fa-IR"/>
+          <w:rtl w:val="0"/>
         </w:rPr>
         <w:t>Server</w:t>
       </w:r>
@@ -808,6 +826,7 @@
           <w:szCs w:val="22"/>
           <w:color w:val="2D2D2D"/>
           <w:lang w:val="en-US" w:bidi="fa-IR"/>
+          <w:rtl w:val="0"/>
         </w:rPr>
         <w:t>Instance</w:t>
       </w:r>
@@ -868,6 +887,7 @@
           <w:szCs w:val="22"/>
           <w:color w:val="2D2D2D"/>
           <w:lang w:val="en-US" w:bidi="fa-IR"/>
+          <w:rtl w:val="0"/>
         </w:rPr>
         <w:t>System</w:t>
       </w:r>
@@ -888,6 +908,7 @@
           <w:szCs w:val="22"/>
           <w:color w:val="2D2D2D"/>
           <w:lang w:val="en-US" w:bidi="fa-IR"/>
+          <w:rtl w:val="0"/>
         </w:rPr>
         <w:t>Database</w:t>
       </w:r>
@@ -998,6 +1019,7 @@
           <w:szCs w:val="22"/>
           <w:color w:val="2D2D2D"/>
           <w:lang w:val="en-US" w:bidi="fa-IR"/>
+          <w:rtl w:val="0"/>
         </w:rPr>
         <w:t>Engine</w:t>
       </w:r>
@@ -1058,6 +1080,7 @@
           <w:szCs w:val="22"/>
           <w:color w:val="2D2D2D"/>
           <w:lang w:val="en-US" w:bidi="fa-IR"/>
+          <w:rtl w:val="0"/>
         </w:rPr>
         <w:t>Instance</w:t>
       </w:r>
@@ -1410,13 +1433,13 @@
         <w:bidiVisual/>
       </w:tblPr>
       <w:tblGrid>
-        <w:gridCol w:w="936"/>
-        <w:gridCol w:w="8702"/>
+        <w:gridCol w:w="1288"/>
+        <w:gridCol w:w="8350"/>
       </w:tblGrid>
       <w:tr>
         <w:tc>
           <w:tcPr>
-            <w:tcW w:type="dxa" w:w="936"/>
+            <w:tcW w:type="dxa" w:w="1288"/>
             <w:shd w:val="clear" w:color="auto" w:fill="6B2FA0"/>
             <w:tcMar>
               <w:top w:w="80" w:type="dxa"/>
@@ -1434,6 +1457,8 @@
           <w:p>
             <w:pPr>
               <w:jc w:val="center"/>
+              <w:keepNext/>
+              <w:keepLines/>
             </w:pPr>
             <w:r>
               <w:rPr>
@@ -1444,7 +1469,7 @@
                 <w:bCs/>
                 <w:color w:val="FFFFFF"/>
                 <w:lang w:val="en-US" w:bidi="fa-IR"/>
-                <w:rtl/>
+                <w:rtl w:val="1"/>
               </w:rPr>
               <w:t>۱.۴.۱</w:t>
             </w:r>
@@ -1452,7 +1477,7 @@
         </w:tc>
         <w:tc>
           <w:tcPr>
-            <w:tcW w:type="dxa" w:w="8702"/>
+            <w:tcW w:type="dxa" w:w="8350"/>
             <w:tcMar>
               <w:top w:w="80" w:type="dxa"/>
               <w:bottom w:w="80" w:type="dxa"/>
@@ -1468,8 +1493,10 @@
           </w:tcPr>
           <w:p>
             <w:pPr>
-              <w:bidi/>
+              <w:bidi w:val="1"/>
               <w:jc w:val="start"/>
+              <w:keepNext/>
+              <w:keepLines/>
             </w:pPr>
             <w:r>
               <w:rPr>
@@ -1492,6 +1519,7 @@
                 <w:bCs/>
                 <w:color w:val="2D2D2D"/>
                 <w:lang w:val="en-US" w:bidi="fa-IR"/>
+                <w:rtl w:val="0"/>
               </w:rPr>
               <w:t>Database Engine</w:t>
             </w:r>
@@ -1502,12 +1530,13 @@
     <w:p>
       <w:pPr>
         <w:spacing w:before="0" w:after="120"/>
+        <w:keepNext/>
       </w:pPr>
       <w:r/>
     </w:p>
     <w:p>
       <w:pPr>
-        <w:bidi/>
+        <w:bidi w:val="1"/>
         <w:spacing w:line="336" w:lineRule="auto" w:after="120"/>
         <w:jc w:val="both"/>
       </w:pPr>
@@ -1518,6 +1547,7 @@
           <w:szCs w:val="22"/>
           <w:color w:val="2D2D2D"/>
           <w:lang w:val="en-US" w:bidi="fa-IR"/>
+          <w:rtl w:val="0"/>
         </w:rPr>
         <w:t>Database</w:t>
       </w:r>
@@ -1538,6 +1568,7 @@
           <w:szCs w:val="22"/>
           <w:color w:val="2D2D2D"/>
           <w:lang w:val="en-US" w:bidi="fa-IR"/>
+          <w:rtl w:val="0"/>
         </w:rPr>
         <w:t>Engine</w:t>
       </w:r>
@@ -1598,6 +1629,7 @@
           <w:szCs w:val="22"/>
           <w:color w:val="2D2D2D"/>
           <w:lang w:val="en-US" w:bidi="fa-IR"/>
+          <w:rtl w:val="0"/>
         </w:rPr>
         <w:t>SQL</w:t>
       </w:r>
@@ -1618,6 +1650,7 @@
           <w:szCs w:val="22"/>
           <w:color w:val="2D2D2D"/>
           <w:lang w:val="en-US" w:bidi="fa-IR"/>
+          <w:rtl w:val="0"/>
         </w:rPr>
         <w:t>Server</w:t>
       </w:r>
@@ -1658,6 +1691,7 @@
           <w:szCs w:val="22"/>
           <w:color w:val="2D2D2D"/>
           <w:lang w:val="en-US" w:bidi="fa-IR"/>
+          <w:rtl w:val="0"/>
         </w:rPr>
         <w:t>Client</w:t>
       </w:r>
@@ -1708,6 +1742,7 @@
           <w:szCs w:val="22"/>
           <w:color w:val="2D2D2D"/>
           <w:lang w:val="en-US" w:bidi="fa-IR"/>
+          <w:rtl w:val="0"/>
         </w:rPr>
         <w:t>Application</w:t>
       </w:r>
@@ -1758,6 +1793,7 @@
           <w:szCs w:val="22"/>
           <w:color w:val="2D2D2D"/>
           <w:lang w:val="en-US" w:bidi="fa-IR"/>
+          <w:rtl w:val="0"/>
         </w:rPr>
         <w:t>Database</w:t>
       </w:r>
@@ -1818,6 +1854,7 @@
           <w:szCs w:val="22"/>
           <w:color w:val="2D2D2D"/>
           <w:lang w:val="en-US" w:bidi="fa-IR"/>
+          <w:rtl w:val="0"/>
         </w:rPr>
         <w:t>Instance</w:t>
       </w:r>
@@ -1878,6 +1915,7 @@
           <w:szCs w:val="22"/>
           <w:color w:val="2D2D2D"/>
           <w:lang w:val="en-US" w:bidi="fa-IR"/>
+          <w:rtl w:val="0"/>
         </w:rPr>
         <w:t>Database</w:t>
       </w:r>
@@ -1898,6 +1936,7 @@
           <w:szCs w:val="22"/>
           <w:color w:val="2D2D2D"/>
           <w:lang w:val="en-US" w:bidi="fa-IR"/>
+          <w:rtl w:val="0"/>
         </w:rPr>
         <w:t>Engine</w:t>
       </w:r>
@@ -1918,6 +1957,7 @@
           <w:szCs w:val="22"/>
           <w:color w:val="2D2D2D"/>
           <w:lang w:val="en-US" w:bidi="fa-IR"/>
+          <w:rtl w:val="0"/>
         </w:rPr>
         <w:t>Query</w:t>
       </w:r>
@@ -2008,6 +2048,7 @@
           <w:szCs w:val="22"/>
           <w:color w:val="2D2D2D"/>
           <w:lang w:val="en-US" w:bidi="fa-IR"/>
+          <w:rtl w:val="0"/>
         </w:rPr>
         <w:t>Database</w:t>
       </w:r>
@@ -2098,6 +2139,7 @@
           <w:szCs w:val="22"/>
           <w:color w:val="2D2D2D"/>
           <w:lang w:val="en-US" w:bidi="fa-IR"/>
+          <w:rtl w:val="0"/>
         </w:rPr>
         <w:t>Security</w:t>
       </w:r>
@@ -2138,6 +2180,7 @@
           <w:szCs w:val="22"/>
           <w:color w:val="2D2D2D"/>
           <w:lang w:val="en-US" w:bidi="fa-IR"/>
+          <w:rtl w:val="0"/>
         </w:rPr>
         <w:t>Transaction</w:t>
       </w:r>
@@ -2400,13 +2443,13 @@
         <w:bidiVisual/>
       </w:tblPr>
       <w:tblGrid>
-        <w:gridCol w:w="936"/>
-        <w:gridCol w:w="8702"/>
+        <w:gridCol w:w="1288"/>
+        <w:gridCol w:w="8350"/>
       </w:tblGrid>
       <w:tr>
         <w:tc>
           <w:tcPr>
-            <w:tcW w:type="dxa" w:w="936"/>
+            <w:tcW w:type="dxa" w:w="1288"/>
             <w:shd w:val="clear" w:color="auto" w:fill="6B2FA0"/>
             <w:tcMar>
               <w:top w:w="80" w:type="dxa"/>
@@ -2424,6 +2467,8 @@
           <w:p>
             <w:pPr>
               <w:jc w:val="center"/>
+              <w:keepNext/>
+              <w:keepLines/>
             </w:pPr>
             <w:r>
               <w:rPr>
@@ -2434,7 +2479,7 @@
                 <w:bCs/>
                 <w:color w:val="FFFFFF"/>
                 <w:lang w:val="en-US" w:bidi="fa-IR"/>
-                <w:rtl/>
+                <w:rtl w:val="1"/>
               </w:rPr>
               <w:t>۱.۴.۲</w:t>
             </w:r>
@@ -2442,7 +2487,7 @@
         </w:tc>
         <w:tc>
           <w:tcPr>
-            <w:tcW w:type="dxa" w:w="8702"/>
+            <w:tcW w:type="dxa" w:w="8350"/>
             <w:tcMar>
               <w:top w:w="80" w:type="dxa"/>
               <w:bottom w:w="80" w:type="dxa"/>
@@ -2458,8 +2503,10 @@
           </w:tcPr>
           <w:p>
             <w:pPr>
-              <w:bidi/>
+              <w:bidi w:val="1"/>
               <w:jc w:val="start"/>
+              <w:keepNext/>
+              <w:keepLines/>
             </w:pPr>
             <w:r>
               <w:rPr>
@@ -2482,6 +2529,7 @@
                 <w:bCs/>
                 <w:color w:val="2D2D2D"/>
                 <w:lang w:val="en-US" w:bidi="fa-IR"/>
+                <w:rtl w:val="0"/>
               </w:rPr>
               <w:t>SQL Server Agent</w:t>
             </w:r>
@@ -2492,12 +2540,13 @@
     <w:p>
       <w:pPr>
         <w:spacing w:before="0" w:after="120"/>
+        <w:keepNext/>
       </w:pPr>
       <w:r/>
     </w:p>
     <w:p>
       <w:pPr>
-        <w:bidi/>
+        <w:bidi w:val="1"/>
         <w:spacing w:line="336" w:lineRule="auto" w:after="120"/>
         <w:jc w:val="both"/>
       </w:pPr>
@@ -2508,6 +2557,7 @@
           <w:szCs w:val="22"/>
           <w:color w:val="2D2D2D"/>
           <w:lang w:val="en-US" w:bidi="fa-IR"/>
+          <w:rtl w:val="0"/>
         </w:rPr>
         <w:t>SQL</w:t>
       </w:r>
@@ -2528,6 +2578,7 @@
           <w:szCs w:val="22"/>
           <w:color w:val="2D2D2D"/>
           <w:lang w:val="en-US" w:bidi="fa-IR"/>
+          <w:rtl w:val="0"/>
         </w:rPr>
         <w:t>Server</w:t>
       </w:r>
@@ -2548,6 +2599,7 @@
           <w:szCs w:val="22"/>
           <w:color w:val="2D2D2D"/>
           <w:lang w:val="en-US" w:bidi="fa-IR"/>
+          <w:rtl w:val="0"/>
         </w:rPr>
         <w:t>Agent</w:t>
       </w:r>
@@ -2588,6 +2640,7 @@
           <w:szCs w:val="22"/>
           <w:color w:val="2D2D2D"/>
           <w:lang w:val="en-US" w:bidi="fa-IR"/>
+          <w:rtl w:val="0"/>
         </w:rPr>
         <w:t>Windows</w:t>
       </w:r>
@@ -2608,6 +2661,7 @@
           <w:szCs w:val="22"/>
           <w:color w:val="2D2D2D"/>
           <w:lang w:val="en-US" w:bidi="fa-IR"/>
+          <w:rtl w:val="0"/>
         </w:rPr>
         <w:t>Service</w:t>
       </w:r>
@@ -2668,6 +2722,7 @@
           <w:szCs w:val="22"/>
           <w:color w:val="2D2D2D"/>
           <w:lang w:val="en-US" w:bidi="fa-IR"/>
+          <w:rtl w:val="0"/>
         </w:rPr>
         <w:t>Automation</w:t>
       </w:r>
@@ -2778,6 +2833,7 @@
           <w:szCs w:val="22"/>
           <w:color w:val="2D2D2D"/>
           <w:lang w:val="en-US" w:bidi="fa-IR"/>
+          <w:rtl w:val="0"/>
         </w:rPr>
         <w:t>Job</w:t>
       </w:r>
@@ -3038,6 +3094,7 @@
           <w:szCs w:val="22"/>
           <w:color w:val="2D2D2D"/>
           <w:lang w:val="en-US" w:bidi="fa-IR"/>
+          <w:rtl w:val="0"/>
         </w:rPr>
         <w:t>Step</w:t>
       </w:r>
@@ -3198,6 +3255,7 @@
           <w:szCs w:val="22"/>
           <w:color w:val="2D2D2D"/>
           <w:lang w:val="en-US" w:bidi="fa-IR"/>
+          <w:rtl w:val="0"/>
         </w:rPr>
         <w:t>Backup</w:t>
       </w:r>
@@ -3248,6 +3306,7 @@
           <w:szCs w:val="22"/>
           <w:color w:val="2D2D2D"/>
           <w:lang w:val="en-US" w:bidi="fa-IR"/>
+          <w:rtl w:val="0"/>
         </w:rPr>
         <w:t>Maintenance</w:t>
       </w:r>
@@ -3358,6 +3417,7 @@
           <w:szCs w:val="22"/>
           <w:color w:val="2D2D2D"/>
           <w:lang w:val="en-US" w:bidi="fa-IR"/>
+          <w:rtl w:val="0"/>
         </w:rPr>
         <w:t>Monitoring</w:t>
       </w:r>
@@ -3488,6 +3548,7 @@
           <w:szCs w:val="22"/>
           <w:color w:val="2D2D2D"/>
           <w:lang w:val="en-US" w:bidi="fa-IR"/>
+          <w:rtl w:val="0"/>
         </w:rPr>
         <w:t>Agent</w:t>
       </w:r>
@@ -3514,7 +3575,7 @@
     </w:p>
     <w:p>
       <w:pPr>
-        <w:bidi/>
+        <w:bidi w:val="1"/>
         <w:spacing w:line="336" w:lineRule="auto" w:after="120"/>
         <w:jc w:val="both"/>
       </w:pPr>
@@ -3545,6 +3606,7 @@
           <w:szCs w:val="22"/>
           <w:color w:val="2D2D2D"/>
           <w:lang w:val="en-US" w:bidi="fa-IR"/>
+          <w:rtl w:val="0"/>
         </w:rPr>
         <w:t>Agent</w:t>
       </w:r>
@@ -3665,6 +3727,7 @@
           <w:szCs w:val="22"/>
           <w:color w:val="2D2D2D"/>
           <w:lang w:val="en-US" w:bidi="fa-IR"/>
+          <w:rtl w:val="0"/>
         </w:rPr>
         <w:t>Job</w:t>
       </w:r>
@@ -3715,6 +3778,7 @@
           <w:szCs w:val="22"/>
           <w:color w:val="2D2D2D"/>
           <w:lang w:val="en-US" w:bidi="fa-IR"/>
+          <w:rtl w:val="0"/>
         </w:rPr>
         <w:t>History</w:t>
       </w:r>
@@ -3815,6 +3879,7 @@
           <w:szCs w:val="22"/>
           <w:color w:val="2D2D2D"/>
           <w:lang w:val="en-US" w:bidi="fa-IR"/>
+          <w:rtl w:val="0"/>
         </w:rPr>
         <w:t>System</w:t>
       </w:r>
@@ -3835,6 +3900,7 @@
           <w:szCs w:val="22"/>
           <w:color w:val="2D2D2D"/>
           <w:lang w:val="en-US" w:bidi="fa-IR"/>
+          <w:rtl w:val="0"/>
         </w:rPr>
         <w:t>Database</w:t>
       </w:r>
@@ -3895,6 +3961,7 @@
           <w:szCs w:val="22"/>
           <w:color w:val="2D2D2D"/>
           <w:lang w:val="en-US" w:bidi="fa-IR"/>
+          <w:rtl w:val="0"/>
         </w:rPr>
         <w:t>msdb</w:t>
       </w:r>
@@ -4095,6 +4162,7 @@
           <w:szCs w:val="22"/>
           <w:color w:val="2D2D2D"/>
           <w:lang w:val="en-US" w:bidi="fa-IR"/>
+          <w:rtl w:val="0"/>
         </w:rPr>
         <w:t>Jobs</w:t>
       </w:r>
@@ -4135,6 +4203,7 @@
           <w:szCs w:val="22"/>
           <w:color w:val="2D2D2D"/>
           <w:lang w:val="en-US" w:bidi="fa-IR"/>
+          <w:rtl w:val="0"/>
         </w:rPr>
         <w:t>Database</w:t>
       </w:r>
@@ -4225,6 +4294,7 @@
           <w:szCs w:val="22"/>
           <w:color w:val="2D2D2D"/>
           <w:lang w:val="en-US" w:bidi="fa-IR"/>
+          <w:rtl w:val="0"/>
         </w:rPr>
         <w:t>Metadata</w:t>
       </w:r>
@@ -4285,6 +4355,7 @@
           <w:szCs w:val="22"/>
           <w:color w:val="2D2D2D"/>
           <w:lang w:val="en-US" w:bidi="fa-IR"/>
+          <w:rtl w:val="0"/>
         </w:rPr>
         <w:t>msdb</w:t>
       </w:r>
@@ -4359,7 +4430,7 @@
           </w:tcPr>
           <w:p>
             <w:pPr>
-              <w:bidi/>
+              <w:bidi w:val="1"/>
               <w:jc w:val="start"/>
             </w:pPr>
             <w:r>
@@ -4395,6 +4466,7 @@
                 <w:bCs/>
                 <w:color w:val="FFFFFF"/>
                 <w:lang w:val="en-US" w:bidi="fa-IR"/>
+                <w:rtl w:val="0"/>
               </w:rPr>
               <w:t>DBA</w:t>
             </w:r>
@@ -4421,7 +4493,7 @@
           </w:tcPr>
           <w:p>
             <w:pPr>
-              <w:bidi/>
+              <w:bidi w:val="1"/>
               <w:spacing w:line="276" w:lineRule="auto" w:after="80"/>
               <w:jc w:val="both"/>
             </w:pPr>
@@ -4472,6 +4544,7 @@
                 <w:szCs w:val="21"/>
                 <w:color w:val="2D2D2D"/>
                 <w:lang w:val="en-US" w:bidi="fa-IR"/>
+                <w:rtl w:val="0"/>
               </w:rPr>
               <w:t>SSMS</w:t>
             </w:r>
@@ -4512,6 +4585,7 @@
                 <w:szCs w:val="21"/>
                 <w:color w:val="2D2D2D"/>
                 <w:lang w:val="en-US" w:bidi="fa-IR"/>
+                <w:rtl w:val="0"/>
               </w:rPr>
               <w:t>Application</w:t>
             </w:r>
@@ -4552,6 +4626,7 @@
                 <w:szCs w:val="21"/>
                 <w:color w:val="2D2D2D"/>
                 <w:lang w:val="en-US" w:bidi="fa-IR"/>
+                <w:rtl w:val="0"/>
               </w:rPr>
               <w:t>Database</w:t>
             </w:r>
@@ -4572,6 +4647,7 @@
                 <w:szCs w:val="21"/>
                 <w:color w:val="2D2D2D"/>
                 <w:lang w:val="en-US" w:bidi="fa-IR"/>
+                <w:rtl w:val="0"/>
               </w:rPr>
               <w:t>Engine</w:t>
             </w:r>
@@ -4592,6 +4668,7 @@
                 <w:szCs w:val="21"/>
                 <w:color w:val="2D2D2D"/>
                 <w:lang w:val="en-US" w:bidi="fa-IR"/>
+                <w:rtl w:val="0"/>
               </w:rPr>
               <w:t>Instance</w:t>
             </w:r>
@@ -4712,6 +4789,7 @@
                 <w:szCs w:val="21"/>
                 <w:color w:val="2D2D2D"/>
                 <w:lang w:val="en-US" w:bidi="fa-IR"/>
+                <w:rtl w:val="0"/>
               </w:rPr>
               <w:t>Windows</w:t>
             </w:r>
@@ -4732,6 +4810,7 @@
                 <w:szCs w:val="21"/>
                 <w:color w:val="2D2D2D"/>
                 <w:lang w:val="en-US" w:bidi="fa-IR"/>
+                <w:rtl w:val="0"/>
               </w:rPr>
               <w:t>Server</w:t>
             </w:r>
@@ -4792,6 +4871,7 @@
                 <w:szCs w:val="21"/>
                 <w:color w:val="2D2D2D"/>
                 <w:lang w:val="en-US" w:bidi="fa-IR"/>
+                <w:rtl w:val="0"/>
               </w:rPr>
               <w:t>Database</w:t>
             </w:r>
@@ -4872,6 +4952,7 @@
                 <w:szCs w:val="21"/>
                 <w:color w:val="2D2D2D"/>
                 <w:lang w:val="en-US" w:bidi="fa-IR"/>
+                <w:rtl w:val="0"/>
               </w:rPr>
               <w:t>Login</w:t>
             </w:r>
@@ -4972,6 +5053,7 @@
                 <w:szCs w:val="21"/>
                 <w:color w:val="2D2D2D"/>
                 <w:lang w:val="en-US" w:bidi="fa-IR"/>
+                <w:rtl w:val="0"/>
               </w:rPr>
               <w:t>Principal</w:t>
             </w:r>
@@ -5062,6 +5144,7 @@
                 <w:szCs w:val="21"/>
                 <w:color w:val="2D2D2D"/>
                 <w:lang w:val="en-US" w:bidi="fa-IR"/>
+                <w:rtl w:val="0"/>
               </w:rPr>
               <w:t>Instance</w:t>
             </w:r>
@@ -5233,13 +5316,13 @@
         <w:bidiVisual/>
       </w:tblPr>
       <w:tblGrid>
-        <w:gridCol w:w="936"/>
-        <w:gridCol w:w="8702"/>
+        <w:gridCol w:w="1288"/>
+        <w:gridCol w:w="8350"/>
       </w:tblGrid>
       <w:tr>
         <w:tc>
           <w:tcPr>
-            <w:tcW w:type="dxa" w:w="936"/>
+            <w:tcW w:type="dxa" w:w="1288"/>
             <w:shd w:val="clear" w:color="auto" w:fill="6B2FA0"/>
             <w:tcMar>
               <w:top w:w="80" w:type="dxa"/>
@@ -5257,6 +5340,8 @@
           <w:p>
             <w:pPr>
               <w:jc w:val="center"/>
+              <w:keepNext/>
+              <w:keepLines/>
             </w:pPr>
             <w:r>
               <w:rPr>
@@ -5267,7 +5352,7 @@
                 <w:bCs/>
                 <w:color w:val="FFFFFF"/>
                 <w:lang w:val="en-US" w:bidi="fa-IR"/>
-                <w:rtl/>
+                <w:rtl w:val="1"/>
               </w:rPr>
               <w:t>۱.۴.۳</w:t>
             </w:r>
@@ -5275,7 +5360,7 @@
         </w:tc>
         <w:tc>
           <w:tcPr>
-            <w:tcW w:type="dxa" w:w="8702"/>
+            <w:tcW w:type="dxa" w:w="8350"/>
             <w:tcMar>
               <w:top w:w="80" w:type="dxa"/>
               <w:bottom w:w="80" w:type="dxa"/>
@@ -5291,8 +5376,10 @@
           </w:tcPr>
           <w:p>
             <w:pPr>
-              <w:bidi/>
+              <w:bidi w:val="1"/>
               <w:jc w:val="start"/>
+              <w:keepNext/>
+              <w:keepLines/>
             </w:pPr>
             <w:r>
               <w:rPr>
@@ -5315,6 +5402,7 @@
                 <w:bCs/>
                 <w:color w:val="2D2D2D"/>
                 <w:lang w:val="en-US" w:bidi="fa-IR"/>
+                <w:rtl w:val="0"/>
               </w:rPr>
               <w:t>SQL Server Database Engine</w:t>
             </w:r>
@@ -5325,12 +5413,13 @@
     <w:p>
       <w:pPr>
         <w:spacing w:before="0" w:after="120"/>
+        <w:keepNext/>
       </w:pPr>
       <w:r/>
     </w:p>
     <w:p>
       <w:pPr>
-        <w:bidi/>
+        <w:bidi w:val="1"/>
         <w:spacing w:line="336" w:lineRule="auto" w:after="120"/>
         <w:jc w:val="both"/>
       </w:pPr>
@@ -5401,6 +5490,7 @@
           <w:szCs w:val="22"/>
           <w:color w:val="2D2D2D"/>
           <w:lang w:val="en-US" w:bidi="fa-IR"/>
+          <w:rtl w:val="0"/>
         </w:rPr>
         <w:t>SQL</w:t>
       </w:r>
@@ -5421,6 +5511,7 @@
           <w:szCs w:val="22"/>
           <w:color w:val="2D2D2D"/>
           <w:lang w:val="en-US" w:bidi="fa-IR"/>
+          <w:rtl w:val="0"/>
         </w:rPr>
         <w:t>Server</w:t>
       </w:r>
@@ -5631,6 +5722,7 @@
           <w:szCs w:val="22"/>
           <w:color w:val="2D2D2D"/>
           <w:lang w:val="en-US" w:bidi="fa-IR"/>
+          <w:rtl w:val="0"/>
         </w:rPr>
         <w:t>Client</w:t>
       </w:r>
@@ -5691,6 +5783,7 @@
           <w:szCs w:val="22"/>
           <w:color w:val="2D2D2D"/>
           <w:lang w:val="en-US" w:bidi="fa-IR"/>
+          <w:rtl w:val="0"/>
         </w:rPr>
         <w:t>Query</w:t>
       </w:r>
@@ -5821,6 +5914,7 @@
           <w:szCs w:val="22"/>
           <w:color w:val="2D2D2D"/>
           <w:lang w:val="en-US" w:bidi="fa-IR"/>
+          <w:rtl w:val="0"/>
         </w:rPr>
         <w:t>Memory</w:t>
       </w:r>
@@ -5961,6 +6055,7 @@
           <w:szCs w:val="22"/>
           <w:color w:val="2D2D2D"/>
           <w:lang w:val="en-US" w:bidi="fa-IR"/>
+          <w:rtl w:val="0"/>
         </w:rPr>
         <w:t>Database</w:t>
       </w:r>
@@ -6001,6 +6096,7 @@
           <w:szCs w:val="22"/>
           <w:color w:val="2D2D2D"/>
           <w:lang w:val="en-US" w:bidi="fa-IR"/>
+          <w:rtl w:val="0"/>
         </w:rPr>
         <w:t>Database</w:t>
       </w:r>
@@ -6021,6 +6117,7 @@
           <w:szCs w:val="22"/>
           <w:color w:val="2D2D2D"/>
           <w:lang w:val="en-US" w:bidi="fa-IR"/>
+          <w:rtl w:val="0"/>
         </w:rPr>
         <w:t>Engine</w:t>
       </w:r>
@@ -6349,6 +6446,8 @@
       <w:pPr>
         <w:spacing w:before="120" w:after="80"/>
         <w:jc w:val="center"/>
+        <w:keepNext/>
+        <w:keepLines/>
       </w:pPr>
       <w:r>
         <w:drawing>
@@ -6387,7 +6486,7 @@
     </w:p>
     <w:p>
       <w:pPr>
-        <w:bidi/>
+        <w:bidi w:val="1"/>
         <w:spacing w:before="40" w:after="200"/>
         <w:jc w:val="center"/>
       </w:pPr>
@@ -6408,6 +6507,7 @@
           <w:szCs w:val="19"/>
           <w:color w:val="5A5A5A"/>
           <w:lang w:val="en-US" w:bidi="fa-IR"/>
+          <w:rtl w:val="0"/>
         </w:rPr>
         <w:t>SQL Server Database Engine</w:t>
       </w:r>
@@ -6452,7 +6552,7 @@
           </w:tcPr>
           <w:p>
             <w:pPr>
-              <w:bidi/>
+              <w:bidi w:val="1"/>
               <w:jc w:val="start"/>
             </w:pPr>
             <w:r>
@@ -6490,7 +6590,7 @@
           </w:tcPr>
           <w:p>
             <w:pPr>
-              <w:bidi/>
+              <w:bidi w:val="1"/>
               <w:spacing w:line="276" w:lineRule="auto" w:after="80"/>
               <w:jc w:val="both"/>
             </w:pPr>
@@ -6501,6 +6601,7 @@
                 <w:szCs w:val="21"/>
                 <w:color w:val="2D2D2D"/>
                 <w:lang w:val="en-US" w:bidi="fa-IR"/>
+                <w:rtl w:val="0"/>
               </w:rPr>
               <w:t>System</w:t>
             </w:r>
@@ -6521,6 +6622,7 @@
                 <w:szCs w:val="21"/>
                 <w:color w:val="2D2D2D"/>
                 <w:lang w:val="en-US" w:bidi="fa-IR"/>
+                <w:rtl w:val="0"/>
               </w:rPr>
               <w:t>Database</w:t>
             </w:r>
@@ -6611,6 +6713,7 @@
                 <w:szCs w:val="21"/>
                 <w:color w:val="2D2D2D"/>
                 <w:lang w:val="en-US" w:bidi="fa-IR"/>
+                <w:rtl w:val="0"/>
               </w:rPr>
               <w:t>Database</w:t>
             </w:r>
@@ -6801,6 +6904,7 @@
                 <w:szCs w:val="21"/>
                 <w:color w:val="2D2D2D"/>
                 <w:lang w:val="en-US" w:bidi="fa-IR"/>
+                <w:rtl w:val="0"/>
               </w:rPr>
               <w:t>Job</w:t>
             </w:r>
@@ -6831,6 +6935,7 @@
                 <w:szCs w:val="21"/>
                 <w:color w:val="2D2D2D"/>
                 <w:lang w:val="en-US" w:bidi="fa-IR"/>
+                <w:rtl w:val="0"/>
               </w:rPr>
               <w:t>SQL</w:t>
             </w:r>
@@ -6851,6 +6956,7 @@
                 <w:szCs w:val="21"/>
                 <w:color w:val="2D2D2D"/>
                 <w:lang w:val="en-US" w:bidi="fa-IR"/>
+                <w:rtl w:val="0"/>
               </w:rPr>
               <w:t>Server</w:t>
             </w:r>
@@ -6871,6 +6977,7 @@
                 <w:szCs w:val="21"/>
                 <w:color w:val="2D2D2D"/>
                 <w:lang w:val="en-US" w:bidi="fa-IR"/>
+                <w:rtl w:val="0"/>
               </w:rPr>
               <w:t>Agent</w:t>
             </w:r>
@@ -6911,6 +7018,7 @@
                 <w:szCs w:val="21"/>
                 <w:color w:val="2D2D2D"/>
                 <w:lang w:val="en-US" w:bidi="fa-IR"/>
+                <w:rtl w:val="0"/>
               </w:rPr>
               <w:t>msdb</w:t>
             </w:r>
@@ -7011,6 +7119,7 @@
                 <w:szCs w:val="21"/>
                 <w:color w:val="2D2D2D"/>
                 <w:lang w:val="en-US" w:bidi="fa-IR"/>
+                <w:rtl w:val="0"/>
               </w:rPr>
               <w:t>Instance</w:t>
             </w:r>
@@ -7051,6 +7160,7 @@
                 <w:szCs w:val="21"/>
                 <w:color w:val="2D2D2D"/>
                 <w:lang w:val="en-US" w:bidi="fa-IR"/>
+                <w:rtl w:val="0"/>
               </w:rPr>
               <w:t>master</w:t>
             </w:r>
@@ -7111,6 +7221,7 @@
                 <w:szCs w:val="21"/>
                 <w:color w:val="2D2D2D"/>
                 <w:lang w:val="en-US" w:bidi="fa-IR"/>
+                <w:rtl w:val="0"/>
               </w:rPr>
               <w:t>Strategy</w:t>
             </w:r>
@@ -7171,6 +7282,7 @@
                 <w:szCs w:val="21"/>
                 <w:color w:val="2D2D2D"/>
                 <w:lang w:val="en-US" w:bidi="fa-IR"/>
+                <w:rtl w:val="0"/>
               </w:rPr>
               <w:t>System</w:t>
             </w:r>
@@ -7191,6 +7303,7 @@
                 <w:szCs w:val="21"/>
                 <w:color w:val="2D2D2D"/>
                 <w:lang w:val="en-US" w:bidi="fa-IR"/>
+                <w:rtl w:val="0"/>
               </w:rPr>
               <w:t>Database</w:t>
             </w:r>
@@ -7261,6 +7374,7 @@
                 <w:szCs w:val="21"/>
                 <w:color w:val="2D2D2D"/>
                 <w:lang w:val="en-US" w:bidi="fa-IR"/>
+                <w:rtl w:val="0"/>
               </w:rPr>
               <w:t>Backup</w:t>
             </w:r>
@@ -7342,13 +7456,13 @@
         <w:bidiVisual/>
       </w:tblPr>
       <w:tblGrid>
-        <w:gridCol w:w="936"/>
-        <w:gridCol w:w="8702"/>
+        <w:gridCol w:w="1200"/>
+        <w:gridCol w:w="8438"/>
       </w:tblGrid>
       <w:tr>
         <w:tc>
           <w:tcPr>
-            <w:tcW w:type="dxa" w:w="936"/>
+            <w:tcW w:type="dxa" w:w="1200"/>
             <w:shd w:val="clear" w:color="auto" w:fill="6B2FA0"/>
             <w:tcMar>
               <w:top w:w="80" w:type="dxa"/>
@@ -7366,6 +7480,8 @@
           <w:p>
             <w:pPr>
               <w:jc w:val="center"/>
+              <w:keepNext/>
+              <w:keepLines/>
             </w:pPr>
             <w:r>
               <w:rPr>
@@ -7376,7 +7492,7 @@
                 <w:bCs/>
                 <w:color w:val="FFFFFF"/>
                 <w:lang w:val="en-US" w:bidi="fa-IR"/>
-                <w:rtl/>
+                <w:rtl w:val="1"/>
               </w:rPr>
               <w:t>۱.۶</w:t>
             </w:r>
@@ -7384,7 +7500,7 @@
         </w:tc>
         <w:tc>
           <w:tcPr>
-            <w:tcW w:type="dxa" w:w="8702"/>
+            <w:tcW w:type="dxa" w:w="8438"/>
             <w:tcMar>
               <w:top w:w="80" w:type="dxa"/>
               <w:bottom w:w="80" w:type="dxa"/>
@@ -7400,8 +7516,10 @@
           </w:tcPr>
           <w:p>
             <w:pPr>
-              <w:bidi/>
+              <w:bidi w:val="1"/>
               <w:jc w:val="start"/>
+              <w:keepNext/>
+              <w:keepLines/>
             </w:pPr>
             <w:r>
               <w:rPr>
@@ -7422,12 +7540,13 @@
     <w:p>
       <w:pPr>
         <w:spacing w:before="0" w:after="120"/>
+        <w:keepNext/>
       </w:pPr>
       <w:r/>
     </w:p>
     <w:p>
       <w:pPr>
-        <w:bidi/>
+        <w:bidi w:val="1"/>
         <w:spacing w:line="336" w:lineRule="auto" w:after="120"/>
         <w:jc w:val="both"/>
       </w:pPr>
@@ -7518,6 +7637,7 @@
           <w:szCs w:val="22"/>
           <w:color w:val="2D2D2D"/>
           <w:lang w:val="en-US" w:bidi="fa-IR"/>
+          <w:rtl w:val="0"/>
         </w:rPr>
         <w:t>Junior</w:t>
       </w:r>
@@ -7538,6 +7658,7 @@
           <w:szCs w:val="22"/>
           <w:color w:val="2D2D2D"/>
           <w:lang w:val="en-US" w:bidi="fa-IR"/>
+          <w:rtl w:val="0"/>
         </w:rPr>
         <w:t>DBA</w:t>
       </w:r>
@@ -7608,6 +7729,7 @@
           <w:szCs w:val="22"/>
           <w:color w:val="2D2D2D"/>
           <w:lang w:val="en-US" w:bidi="fa-IR"/>
+          <w:rtl w:val="0"/>
         </w:rPr>
         <w:t>User</w:t>
       </w:r>
@@ -7648,6 +7770,7 @@
           <w:szCs w:val="22"/>
           <w:color w:val="2D2D2D"/>
           <w:lang w:val="en-US" w:bidi="fa-IR"/>
+          <w:rtl w:val="0"/>
         </w:rPr>
         <w:t>Login</w:t>
       </w:r>
@@ -7874,7 +7997,7 @@
     </w:p>
     <w:p>
       <w:pPr>
-        <w:bidi/>
+        <w:bidi w:val="1"/>
         <w:spacing w:line="336" w:lineRule="auto" w:after="120"/>
         <w:jc w:val="both"/>
         <w:pBdr>
@@ -7889,6 +8012,7 @@
           <w:szCs w:val="21"/>
           <w:color w:val="2D2D2D"/>
           <w:lang w:val="en-US" w:bidi="fa-IR"/>
+          <w:rtl w:val="0"/>
         </w:rPr>
         <w:t>Login</w:t>
       </w:r>
@@ -8009,6 +8133,7 @@
           <w:szCs w:val="21"/>
           <w:color w:val="2D2D2D"/>
           <w:lang w:val="en-US" w:bidi="fa-IR"/>
+          <w:rtl w:val="0"/>
         </w:rPr>
         <w:t>Instance</w:t>
       </w:r>
@@ -8049,6 +8174,7 @@
           <w:szCs w:val="21"/>
           <w:color w:val="2D2D2D"/>
           <w:lang w:val="en-US" w:bidi="fa-IR"/>
+          <w:rtl w:val="0"/>
         </w:rPr>
         <w:t>User</w:t>
       </w:r>
@@ -8169,6 +8295,7 @@
           <w:szCs w:val="21"/>
           <w:color w:val="2D2D2D"/>
           <w:lang w:val="en-US" w:bidi="fa-IR"/>
+          <w:rtl w:val="0"/>
         </w:rPr>
         <w:t>Database</w:t>
       </w:r>
@@ -8249,6 +8376,7 @@
           <w:szCs w:val="21"/>
           <w:color w:val="2D2D2D"/>
           <w:lang w:val="en-US" w:bidi="fa-IR"/>
+          <w:rtl w:val="0"/>
         </w:rPr>
         <w:t>Object</w:t>
       </w:r>
@@ -8325,7 +8453,7 @@
     </w:p>
     <w:p>
       <w:pPr>
-        <w:bidi/>
+        <w:bidi w:val="1"/>
         <w:spacing w:line="336" w:lineRule="auto" w:after="120"/>
         <w:jc w:val="both"/>
       </w:pPr>
@@ -8376,6 +8504,7 @@
           <w:szCs w:val="22"/>
           <w:color w:val="2D2D2D"/>
           <w:lang w:val="en-US" w:bidi="fa-IR"/>
+          <w:rtl w:val="0"/>
         </w:rPr>
         <w:t>Login</w:t>
       </w:r>
@@ -8476,6 +8605,7 @@
           <w:szCs w:val="22"/>
           <w:color w:val="2D2D2D"/>
           <w:lang w:val="en-US" w:bidi="fa-IR"/>
+          <w:rtl w:val="0"/>
         </w:rPr>
         <w:t>Instance</w:t>
       </w:r>
@@ -8696,6 +8826,7 @@
           <w:szCs w:val="22"/>
           <w:color w:val="2D2D2D"/>
           <w:lang w:val="en-US" w:bidi="fa-IR"/>
+          <w:rtl w:val="0"/>
         </w:rPr>
         <w:t>Database</w:t>
       </w:r>
@@ -8926,6 +9057,7 @@
           <w:szCs w:val="22"/>
           <w:color w:val="2D2D2D"/>
           <w:lang w:val="en-US" w:bidi="fa-IR"/>
+          <w:rtl w:val="0"/>
         </w:rPr>
         <w:t>Database</w:t>
       </w:r>
@@ -8976,6 +9108,7 @@
           <w:szCs w:val="22"/>
           <w:color w:val="2D2D2D"/>
           <w:lang w:val="en-US" w:bidi="fa-IR"/>
+          <w:rtl w:val="0"/>
         </w:rPr>
         <w:t>Login</w:t>
       </w:r>
@@ -9036,6 +9169,7 @@
           <w:szCs w:val="22"/>
           <w:color w:val="2D2D2D"/>
           <w:lang w:val="en-US" w:bidi="fa-IR"/>
+          <w:rtl w:val="0"/>
         </w:rPr>
         <w:t>User</w:t>
       </w:r>
@@ -9076,6 +9210,7 @@
           <w:szCs w:val="22"/>
           <w:color w:val="2D2D2D"/>
           <w:lang w:val="en-US" w:bidi="fa-IR"/>
+          <w:rtl w:val="0"/>
         </w:rPr>
         <w:t>(Map)</w:t>
       </w:r>
@@ -9136,6 +9271,7 @@
           <w:szCs w:val="22"/>
           <w:color w:val="2D2D2D"/>
           <w:lang w:val="en-US" w:bidi="fa-IR"/>
+          <w:rtl w:val="0"/>
         </w:rPr>
         <w:t>Permission</w:t>
       </w:r>
@@ -9236,6 +9372,7 @@
           <w:szCs w:val="22"/>
           <w:color w:val="2D2D2D"/>
           <w:lang w:val="en-US" w:bidi="fa-IR"/>
+          <w:rtl w:val="0"/>
         </w:rPr>
         <w:t>User</w:t>
       </w:r>
@@ -9276,6 +9413,7 @@
           <w:szCs w:val="22"/>
           <w:color w:val="2D2D2D"/>
           <w:lang w:val="en-US" w:bidi="fa-IR"/>
+          <w:rtl w:val="0"/>
         </w:rPr>
         <w:t>Role</w:t>
       </w:r>
@@ -9306,6 +9444,7 @@
           <w:szCs w:val="22"/>
           <w:color w:val="2D2D2D"/>
           <w:lang w:val="en-US" w:bidi="fa-IR"/>
+          <w:rtl w:val="0"/>
         </w:rPr>
         <w:t>Database</w:t>
       </w:r>
@@ -9386,7 +9525,7 @@
           </w:tcPr>
           <w:p>
             <w:pPr>
-              <w:bidi/>
+              <w:bidi w:val="1"/>
               <w:spacing w:line="276" w:lineRule="auto" w:after="80"/>
               <w:jc w:val="left"/>
             </w:pPr>
@@ -9423,7 +9562,7 @@
           </w:tcPr>
           <w:p>
             <w:pPr>
-              <w:bidi/>
+              <w:bidi w:val="1"/>
               <w:spacing w:line="276" w:lineRule="auto" w:after="80"/>
               <w:jc w:val="left"/>
             </w:pPr>
@@ -9484,7 +9623,7 @@
           </w:tcPr>
           <w:p>
             <w:pPr>
-              <w:bidi/>
+              <w:bidi w:val="1"/>
               <w:spacing w:line="276" w:lineRule="auto" w:after="80"/>
               <w:jc w:val="left"/>
             </w:pPr>
@@ -9526,6 +9665,7 @@
           </w:tcPr>
           <w:p>
             <w:pPr>
+              <w:bidi w:val="0"/>
               <w:spacing w:line="276" w:lineRule="auto" w:after="80"/>
               <w:jc w:val="left"/>
             </w:pPr>
@@ -9536,6 +9676,7 @@
                 <w:szCs w:val="21"/>
                 <w:color w:val="2D2D2D"/>
                 <w:lang w:val="en-US" w:bidi="fa-IR"/>
+                <w:rtl w:val="0"/>
               </w:rPr>
               <w:t>Login</w:t>
             </w:r>
@@ -9560,6 +9701,7 @@
           </w:tcPr>
           <w:p>
             <w:pPr>
+              <w:bidi w:val="0"/>
               <w:spacing w:line="276" w:lineRule="auto" w:after="80"/>
               <w:jc w:val="left"/>
             </w:pPr>
@@ -9570,6 +9712,7 @@
                 <w:szCs w:val="21"/>
                 <w:color w:val="2D2D2D"/>
                 <w:lang w:val="en-US" w:bidi="fa-IR"/>
+                <w:rtl w:val="0"/>
               </w:rPr>
               <w:t>Instance</w:t>
             </w:r>
@@ -9594,6 +9737,7 @@
           </w:tcPr>
           <w:p>
             <w:pPr>
+              <w:bidi w:val="0"/>
               <w:spacing w:line="276" w:lineRule="auto" w:after="80"/>
               <w:jc w:val="left"/>
             </w:pPr>
@@ -9604,6 +9748,7 @@
                 <w:szCs w:val="21"/>
                 <w:color w:val="2D2D2D"/>
                 <w:lang w:val="en-US" w:bidi="fa-IR"/>
+                <w:rtl w:val="0"/>
               </w:rPr>
               <w:t>DOMAIN</w:t>
             </w:r>
@@ -9624,6 +9769,7 @@
                 <w:szCs w:val="21"/>
                 <w:color w:val="2D2D2D"/>
                 <w:lang w:val="en-US" w:bidi="fa-IR"/>
+                <w:rtl w:val="0"/>
               </w:rPr>
               <w:t>Niloofar</w:t>
             </w:r>
@@ -9653,6 +9799,7 @@
           </w:tcPr>
           <w:p>
             <w:pPr>
+              <w:bidi w:val="0"/>
               <w:spacing w:line="276" w:lineRule="auto" w:after="80"/>
               <w:jc w:val="left"/>
             </w:pPr>
@@ -9663,6 +9810,7 @@
                 <w:szCs w:val="21"/>
                 <w:color w:val="2D2D2D"/>
                 <w:lang w:val="en-US" w:bidi="fa-IR"/>
+                <w:rtl w:val="0"/>
               </w:rPr>
               <w:t>User</w:t>
             </w:r>
@@ -9687,6 +9835,7 @@
           </w:tcPr>
           <w:p>
             <w:pPr>
+              <w:bidi w:val="0"/>
               <w:spacing w:line="276" w:lineRule="auto" w:after="80"/>
               <w:jc w:val="left"/>
             </w:pPr>
@@ -9697,6 +9846,7 @@
                 <w:szCs w:val="21"/>
                 <w:color w:val="2D2D2D"/>
                 <w:lang w:val="en-US" w:bidi="fa-IR"/>
+                <w:rtl w:val="0"/>
               </w:rPr>
               <w:t>Database</w:t>
             </w:r>
@@ -9721,6 +9871,7 @@
           </w:tcPr>
           <w:p>
             <w:pPr>
+              <w:bidi w:val="0"/>
               <w:spacing w:line="276" w:lineRule="auto" w:after="80"/>
               <w:jc w:val="left"/>
             </w:pPr>
@@ -9731,6 +9882,7 @@
                 <w:szCs w:val="21"/>
                 <w:color w:val="2D2D2D"/>
                 <w:lang w:val="en-US" w:bidi="fa-IR"/>
+                <w:rtl w:val="0"/>
               </w:rPr>
               <w:t>Niloofar</w:t>
             </w:r>
@@ -9760,6 +9912,7 @@
           </w:tcPr>
           <w:p>
             <w:pPr>
+              <w:bidi w:val="0"/>
               <w:spacing w:line="276" w:lineRule="auto" w:after="80"/>
               <w:jc w:val="left"/>
             </w:pPr>
@@ -9770,6 +9923,7 @@
                 <w:szCs w:val="21"/>
                 <w:color w:val="2D2D2D"/>
                 <w:lang w:val="en-US" w:bidi="fa-IR"/>
+                <w:rtl w:val="0"/>
               </w:rPr>
               <w:t>Database</w:t>
             </w:r>
@@ -9790,6 +9944,7 @@
                 <w:szCs w:val="21"/>
                 <w:color w:val="2D2D2D"/>
                 <w:lang w:val="en-US" w:bidi="fa-IR"/>
+                <w:rtl w:val="0"/>
               </w:rPr>
               <w:t>Role</w:t>
             </w:r>
@@ -9814,6 +9969,7 @@
           </w:tcPr>
           <w:p>
             <w:pPr>
+              <w:bidi w:val="0"/>
               <w:spacing w:line="276" w:lineRule="auto" w:after="80"/>
               <w:jc w:val="left"/>
             </w:pPr>
@@ -9824,6 +9980,7 @@
                 <w:szCs w:val="21"/>
                 <w:color w:val="2D2D2D"/>
                 <w:lang w:val="en-US" w:bidi="fa-IR"/>
+                <w:rtl w:val="0"/>
               </w:rPr>
               <w:t>Database</w:t>
             </w:r>
@@ -9848,6 +10005,7 @@
           </w:tcPr>
           <w:p>
             <w:pPr>
+              <w:bidi w:val="0"/>
               <w:spacing w:line="276" w:lineRule="auto" w:after="80"/>
               <w:jc w:val="left"/>
             </w:pPr>
@@ -9858,6 +10016,7 @@
                 <w:szCs w:val="21"/>
                 <w:color w:val="2D2D2D"/>
                 <w:lang w:val="en-US" w:bidi="fa-IR"/>
+                <w:rtl w:val="0"/>
               </w:rPr>
               <w:t>db_datareader</w:t>
             </w:r>
@@ -9873,7 +10032,7 @@
     </w:p>
     <w:p>
       <w:pPr>
-        <w:bidi/>
+        <w:bidi w:val="1"/>
         <w:spacing w:line="336" w:lineRule="auto" w:after="120"/>
         <w:jc w:val="both"/>
       </w:pPr>
@@ -10004,6 +10163,7 @@
           <w:szCs w:val="22"/>
           <w:color w:val="2D2D2D"/>
           <w:lang w:val="en-US" w:bidi="fa-IR"/>
+          <w:rtl w:val="0"/>
         </w:rPr>
         <w:t>Contained</w:t>
       </w:r>
@@ -10024,6 +10184,7 @@
           <w:szCs w:val="22"/>
           <w:color w:val="2D2D2D"/>
           <w:lang w:val="en-US" w:bidi="fa-IR"/>
+          <w:rtl w:val="0"/>
         </w:rPr>
         <w:t>Database</w:t>
       </w:r>
@@ -10044,6 +10205,7 @@
           <w:szCs w:val="22"/>
           <w:color w:val="2D2D2D"/>
           <w:lang w:val="en-US" w:bidi="fa-IR"/>
+          <w:rtl w:val="0"/>
         </w:rPr>
         <w:t>User</w:t>
       </w:r>
@@ -10094,6 +10256,7 @@
           <w:szCs w:val="22"/>
           <w:color w:val="2D2D2D"/>
           <w:lang w:val="en-US" w:bidi="fa-IR"/>
+          <w:rtl w:val="0"/>
         </w:rPr>
         <w:t>Database</w:t>
       </w:r>
@@ -10154,6 +10317,7 @@
           <w:szCs w:val="22"/>
           <w:color w:val="2D2D2D"/>
           <w:lang w:val="en-US" w:bidi="fa-IR"/>
+          <w:rtl w:val="0"/>
         </w:rPr>
         <w:t>Login</w:t>
       </w:r>
@@ -10194,6 +10358,7 @@
           <w:szCs w:val="22"/>
           <w:color w:val="2D2D2D"/>
           <w:lang w:val="en-US" w:bidi="fa-IR"/>
+          <w:rtl w:val="0"/>
         </w:rPr>
         <w:t>Instance</w:t>
       </w:r>
@@ -10264,6 +10429,7 @@
           <w:szCs w:val="22"/>
           <w:color w:val="2D2D2D"/>
           <w:lang w:val="en-US" w:bidi="fa-IR"/>
+          <w:rtl w:val="0"/>
         </w:rPr>
         <w:t>Login</w:t>
       </w:r>
@@ -10330,7 +10496,7 @@
     </w:p>
     <w:p>
       <w:pPr>
-        <w:bidi/>
+        <w:bidi w:val="1"/>
         <w:spacing w:line="336" w:lineRule="auto" w:after="120"/>
         <w:jc w:val="both"/>
       </w:pPr>
@@ -10381,6 +10547,7 @@
           <w:szCs w:val="22"/>
           <w:color w:val="2D2D2D"/>
           <w:lang w:val="en-US" w:bidi="fa-IR"/>
+          <w:rtl w:val="0"/>
         </w:rPr>
         <w:t>T-SQL</w:t>
       </w:r>
@@ -10441,6 +10608,7 @@
           <w:szCs w:val="22"/>
           <w:color w:val="2D2D2D"/>
           <w:lang w:val="en-US" w:bidi="fa-IR"/>
+          <w:rtl w:val="0"/>
         </w:rPr>
         <w:t>Login</w:t>
       </w:r>
@@ -10601,6 +10769,7 @@
           <w:szCs w:val="22"/>
           <w:color w:val="2D2D2D"/>
           <w:lang w:val="en-US" w:bidi="fa-IR"/>
+          <w:rtl w:val="0"/>
         </w:rPr>
         <w:t>User</w:t>
       </w:r>
@@ -10661,6 +10830,7 @@
           <w:szCs w:val="22"/>
           <w:color w:val="2D2D2D"/>
           <w:lang w:val="en-US" w:bidi="fa-IR"/>
+          <w:rtl w:val="0"/>
         </w:rPr>
         <w:t>Database</w:t>
       </w:r>
@@ -10705,6 +10875,7 @@
           </w:tcPr>
           <w:p>
             <w:pPr>
+              <w:bidi w:val="0"/>
               <w:spacing w:before="0" w:after="0" w:line="276" w:lineRule="auto"/>
               <w:jc w:val="left"/>
             </w:pPr>
@@ -10717,12 +10888,14 @@
                 <w:iCs/>
                 <w:color w:val="60a0b0"/>
                 <w:lang w:val="en-US" w:bidi="fa-IR"/>
+                <w:rtl w:val="0"/>
               </w:rPr>
               <w:t>-- ایجاد Login ویندوزی در سطح Instance</w:t>
             </w:r>
           </w:p>
           <w:p>
             <w:pPr>
+              <w:bidi w:val="0"/>
               <w:spacing w:before="0" w:after="0" w:line="276" w:lineRule="auto"/>
               <w:jc w:val="left"/>
             </w:pPr>
@@ -10735,6 +10908,7 @@
                 <w:bCs/>
                 <w:color w:val="007020"/>
                 <w:lang w:val="en-US" w:bidi="fa-IR"/>
+                <w:rtl w:val="0"/>
               </w:rPr>
               <w:t>CREATE</w:t>
             </w:r>
@@ -10745,6 +10919,7 @@
                 <w:szCs w:val="19"/>
                 <w:color w:val="bbbbbb"/>
                 <w:lang w:val="en-US" w:bidi="fa-IR"/>
+                <w:rtl w:val="0"/>
               </w:rPr>
               <w:t xml:space="preserve"> </w:t>
             </w:r>
@@ -10755,6 +10930,7 @@
                 <w:szCs w:val="19"/>
                 <w:color w:val="24292E"/>
                 <w:lang w:val="en-US" w:bidi="fa-IR"/>
+                <w:rtl w:val="0"/>
               </w:rPr>
               <w:t>LOGIN</w:t>
             </w:r>
@@ -10765,6 +10941,7 @@
                 <w:szCs w:val="19"/>
                 <w:color w:val="bbbbbb"/>
                 <w:lang w:val="en-US" w:bidi="fa-IR"/>
+                <w:rtl w:val="0"/>
               </w:rPr>
               <w:t xml:space="preserve"> </w:t>
             </w:r>
@@ -10775,6 +10952,7 @@
                 <w:szCs w:val="19"/>
                 <w:color w:val="24292E"/>
                 <w:lang w:val="en-US" w:bidi="fa-IR"/>
+                <w:rtl w:val="0"/>
               </w:rPr>
               <w:t>[</w:t>
             </w:r>
@@ -10787,6 +10965,7 @@
                 <w:bCs/>
                 <w:color w:val="007020"/>
                 <w:lang w:val="en-US" w:bidi="fa-IR"/>
+                <w:rtl w:val="0"/>
               </w:rPr>
               <w:t>DOMAIN</w:t>
             </w:r>
@@ -10797,6 +10976,7 @@
                 <w:szCs w:val="19"/>
                 <w:color w:val="24292E"/>
                 <w:lang w:val="en-US" w:bidi="fa-IR"/>
+                <w:rtl w:val="0"/>
               </w:rPr>
               <w:t>\</w:t>
             </w:r>
@@ -10807,6 +10987,7 @@
                 <w:szCs w:val="19"/>
                 <w:color w:val="24292E"/>
                 <w:lang w:val="en-US" w:bidi="fa-IR"/>
+                <w:rtl w:val="0"/>
               </w:rPr>
               <w:t>Niloofar</w:t>
             </w:r>
@@ -10817,6 +10998,7 @@
                 <w:szCs w:val="19"/>
                 <w:color w:val="24292E"/>
                 <w:lang w:val="en-US" w:bidi="fa-IR"/>
+                <w:rtl w:val="0"/>
               </w:rPr>
               <w:t>]</w:t>
             </w:r>
@@ -10827,6 +11009,7 @@
                 <w:szCs w:val="19"/>
                 <w:color w:val="bbbbbb"/>
                 <w:lang w:val="en-US" w:bidi="fa-IR"/>
+                <w:rtl w:val="0"/>
               </w:rPr>
               <w:t xml:space="preserve"> </w:t>
             </w:r>
@@ -10839,6 +11022,7 @@
                 <w:bCs/>
                 <w:color w:val="007020"/>
                 <w:lang w:val="en-US" w:bidi="fa-IR"/>
+                <w:rtl w:val="0"/>
               </w:rPr>
               <w:t>FROM</w:t>
             </w:r>
@@ -10849,6 +11033,7 @@
                 <w:szCs w:val="19"/>
                 <w:color w:val="bbbbbb"/>
                 <w:lang w:val="en-US" w:bidi="fa-IR"/>
+                <w:rtl w:val="0"/>
               </w:rPr>
               <w:t xml:space="preserve"> </w:t>
             </w:r>
@@ -10859,6 +11044,7 @@
                 <w:szCs w:val="19"/>
                 <w:color w:val="24292E"/>
                 <w:lang w:val="en-US" w:bidi="fa-IR"/>
+                <w:rtl w:val="0"/>
               </w:rPr>
               <w:t>WINDOWS</w:t>
             </w:r>
@@ -10869,12 +11055,14 @@
                 <w:szCs w:val="19"/>
                 <w:color w:val="24292E"/>
                 <w:lang w:val="en-US" w:bidi="fa-IR"/>
+                <w:rtl w:val="0"/>
               </w:rPr>
               <w:t>;</w:t>
             </w:r>
           </w:p>
           <w:p>
             <w:pPr>
+              <w:bidi w:val="0"/>
               <w:spacing w:before="0" w:after="0" w:line="276" w:lineRule="auto"/>
               <w:jc w:val="left"/>
             </w:pPr>
@@ -10887,12 +11075,14 @@
                 <w:bCs/>
                 <w:color w:val="007020"/>
                 <w:lang w:val="en-US" w:bidi="fa-IR"/>
+                <w:rtl w:val="0"/>
               </w:rPr>
               <w:t>GO</w:t>
             </w:r>
           </w:p>
           <w:p>
             <w:pPr>
+              <w:bidi w:val="0"/>
               <w:spacing w:before="0" w:after="0" w:line="276" w:lineRule="auto"/>
               <w:jc w:val="left"/>
             </w:pPr>
@@ -10903,11 +11093,13 @@
                 <w:szCs w:val="19"/>
                 <w:color w:val="24292E"/>
                 <w:lang w:val="en-US" w:bidi="fa-IR"/>
+                <w:rtl w:val="0"/>
               </w:rPr>
             </w:r>
           </w:p>
           <w:p>
             <w:pPr>
+              <w:bidi w:val="0"/>
               <w:spacing w:before="0" w:after="0" w:line="276" w:lineRule="auto"/>
               <w:jc w:val="left"/>
             </w:pPr>
@@ -10920,12 +11112,14 @@
                 <w:iCs/>
                 <w:color w:val="60a0b0"/>
                 <w:lang w:val="en-US" w:bidi="fa-IR"/>
+                <w:rtl w:val="0"/>
               </w:rPr>
               <w:t>-- اتصال به پایگاه داده و ایجاد User متناظر همراه با عضویت در Role</w:t>
             </w:r>
           </w:p>
           <w:p>
             <w:pPr>
+              <w:bidi w:val="0"/>
               <w:spacing w:before="0" w:after="0" w:line="276" w:lineRule="auto"/>
               <w:jc w:val="left"/>
             </w:pPr>
@@ -10936,6 +11130,7 @@
                 <w:szCs w:val="19"/>
                 <w:color w:val="24292E"/>
                 <w:lang w:val="en-US" w:bidi="fa-IR"/>
+                <w:rtl w:val="0"/>
               </w:rPr>
               <w:t>USE</w:t>
             </w:r>
@@ -10946,6 +11141,7 @@
                 <w:szCs w:val="19"/>
                 <w:color w:val="bbbbbb"/>
                 <w:lang w:val="en-US" w:bidi="fa-IR"/>
+                <w:rtl w:val="0"/>
               </w:rPr>
               <w:t xml:space="preserve"> </w:t>
             </w:r>
@@ -10956,6 +11152,7 @@
                 <w:szCs w:val="19"/>
                 <w:color w:val="24292E"/>
                 <w:lang w:val="en-US" w:bidi="fa-IR"/>
+                <w:rtl w:val="0"/>
               </w:rPr>
               <w:t>[</w:t>
             </w:r>
@@ -10966,6 +11163,7 @@
                 <w:szCs w:val="19"/>
                 <w:color w:val="24292E"/>
                 <w:lang w:val="en-US" w:bidi="fa-IR"/>
+                <w:rtl w:val="0"/>
               </w:rPr>
               <w:t>SalesDatabase</w:t>
             </w:r>
@@ -10976,6 +11174,7 @@
                 <w:szCs w:val="19"/>
                 <w:color w:val="24292E"/>
                 <w:lang w:val="en-US" w:bidi="fa-IR"/>
+                <w:rtl w:val="0"/>
               </w:rPr>
               <w:t>]</w:t>
             </w:r>
@@ -10986,12 +11185,14 @@
                 <w:szCs w:val="19"/>
                 <w:color w:val="24292E"/>
                 <w:lang w:val="en-US" w:bidi="fa-IR"/>
+                <w:rtl w:val="0"/>
               </w:rPr>
               <w:t>;</w:t>
             </w:r>
           </w:p>
           <w:p>
             <w:pPr>
+              <w:bidi w:val="0"/>
               <w:spacing w:before="0" w:after="0" w:line="276" w:lineRule="auto"/>
               <w:jc w:val="left"/>
             </w:pPr>
@@ -11004,12 +11205,14 @@
                 <w:bCs/>
                 <w:color w:val="007020"/>
                 <w:lang w:val="en-US" w:bidi="fa-IR"/>
+                <w:rtl w:val="0"/>
               </w:rPr>
               <w:t>GO</w:t>
             </w:r>
           </w:p>
           <w:p>
             <w:pPr>
+              <w:bidi w:val="0"/>
               <w:spacing w:before="0" w:after="0" w:line="276" w:lineRule="auto"/>
               <w:jc w:val="left"/>
             </w:pPr>
@@ -11022,6 +11225,7 @@
                 <w:bCs/>
                 <w:color w:val="007020"/>
                 <w:lang w:val="en-US" w:bidi="fa-IR"/>
+                <w:rtl w:val="0"/>
               </w:rPr>
               <w:t>CREATE</w:t>
             </w:r>
@@ -11032,6 +11236,7 @@
                 <w:szCs w:val="19"/>
                 <w:color w:val="bbbbbb"/>
                 <w:lang w:val="en-US" w:bidi="fa-IR"/>
+                <w:rtl w:val="0"/>
               </w:rPr>
               <w:t xml:space="preserve"> </w:t>
             </w:r>
@@ -11044,6 +11249,7 @@
                 <w:bCs/>
                 <w:color w:val="007020"/>
                 <w:lang w:val="en-US" w:bidi="fa-IR"/>
+                <w:rtl w:val="0"/>
               </w:rPr>
               <w:t>USER</w:t>
             </w:r>
@@ -11054,6 +11260,7 @@
                 <w:szCs w:val="19"/>
                 <w:color w:val="bbbbbb"/>
                 <w:lang w:val="en-US" w:bidi="fa-IR"/>
+                <w:rtl w:val="0"/>
               </w:rPr>
               <w:t xml:space="preserve"> </w:t>
             </w:r>
@@ -11064,6 +11271,7 @@
                 <w:szCs w:val="19"/>
                 <w:color w:val="24292E"/>
                 <w:lang w:val="en-US" w:bidi="fa-IR"/>
+                <w:rtl w:val="0"/>
               </w:rPr>
               <w:t>[</w:t>
             </w:r>
@@ -11074,6 +11282,7 @@
                 <w:szCs w:val="19"/>
                 <w:color w:val="24292E"/>
                 <w:lang w:val="en-US" w:bidi="fa-IR"/>
+                <w:rtl w:val="0"/>
               </w:rPr>
               <w:t>Niloofar</w:t>
             </w:r>
@@ -11084,6 +11293,7 @@
                 <w:szCs w:val="19"/>
                 <w:color w:val="24292E"/>
                 <w:lang w:val="en-US" w:bidi="fa-IR"/>
+                <w:rtl w:val="0"/>
               </w:rPr>
               <w:t>]</w:t>
             </w:r>
@@ -11094,6 +11304,7 @@
                 <w:szCs w:val="19"/>
                 <w:color w:val="bbbbbb"/>
                 <w:lang w:val="en-US" w:bidi="fa-IR"/>
+                <w:rtl w:val="0"/>
               </w:rPr>
               <w:t xml:space="preserve"> </w:t>
             </w:r>
@@ -11106,6 +11317,7 @@
                 <w:bCs/>
                 <w:color w:val="007020"/>
                 <w:lang w:val="en-US" w:bidi="fa-IR"/>
+                <w:rtl w:val="0"/>
               </w:rPr>
               <w:t>FOR</w:t>
             </w:r>
@@ -11116,6 +11328,7 @@
                 <w:szCs w:val="19"/>
                 <w:color w:val="bbbbbb"/>
                 <w:lang w:val="en-US" w:bidi="fa-IR"/>
+                <w:rtl w:val="0"/>
               </w:rPr>
               <w:t xml:space="preserve"> </w:t>
             </w:r>
@@ -11126,6 +11339,7 @@
                 <w:szCs w:val="19"/>
                 <w:color w:val="24292E"/>
                 <w:lang w:val="en-US" w:bidi="fa-IR"/>
+                <w:rtl w:val="0"/>
               </w:rPr>
               <w:t>LOGIN</w:t>
             </w:r>
@@ -11136,6 +11350,7 @@
                 <w:szCs w:val="19"/>
                 <w:color w:val="bbbbbb"/>
                 <w:lang w:val="en-US" w:bidi="fa-IR"/>
+                <w:rtl w:val="0"/>
               </w:rPr>
               <w:t xml:space="preserve"> </w:t>
             </w:r>
@@ -11146,6 +11361,7 @@
                 <w:szCs w:val="19"/>
                 <w:color w:val="24292E"/>
                 <w:lang w:val="en-US" w:bidi="fa-IR"/>
+                <w:rtl w:val="0"/>
               </w:rPr>
               <w:t>[</w:t>
             </w:r>
@@ -11158,6 +11374,7 @@
                 <w:bCs/>
                 <w:color w:val="007020"/>
                 <w:lang w:val="en-US" w:bidi="fa-IR"/>
+                <w:rtl w:val="0"/>
               </w:rPr>
               <w:t>DOMAIN</w:t>
             </w:r>
@@ -11168,6 +11385,7 @@
                 <w:szCs w:val="19"/>
                 <w:color w:val="24292E"/>
                 <w:lang w:val="en-US" w:bidi="fa-IR"/>
+                <w:rtl w:val="0"/>
               </w:rPr>
               <w:t>\</w:t>
             </w:r>
@@ -11178,6 +11396,7 @@
                 <w:szCs w:val="19"/>
                 <w:color w:val="24292E"/>
                 <w:lang w:val="en-US" w:bidi="fa-IR"/>
+                <w:rtl w:val="0"/>
               </w:rPr>
               <w:t>Niloofar</w:t>
             </w:r>
@@ -11188,6 +11407,7 @@
                 <w:szCs w:val="19"/>
                 <w:color w:val="24292E"/>
                 <w:lang w:val="en-US" w:bidi="fa-IR"/>
+                <w:rtl w:val="0"/>
               </w:rPr>
               <w:t>]</w:t>
             </w:r>
@@ -11198,12 +11418,14 @@
                 <w:szCs w:val="19"/>
                 <w:color w:val="24292E"/>
                 <w:lang w:val="en-US" w:bidi="fa-IR"/>
+                <w:rtl w:val="0"/>
               </w:rPr>
               <w:t>;</w:t>
             </w:r>
           </w:p>
           <w:p>
             <w:pPr>
+              <w:bidi w:val="0"/>
               <w:spacing w:before="0" w:after="0" w:line="276" w:lineRule="auto"/>
               <w:jc w:val="left"/>
             </w:pPr>
@@ -11216,6 +11438,7 @@
                 <w:bCs/>
                 <w:color w:val="007020"/>
                 <w:lang w:val="en-US" w:bidi="fa-IR"/>
+                <w:rtl w:val="0"/>
               </w:rPr>
               <w:t>ALTER</w:t>
             </w:r>
@@ -11226,6 +11449,7 @@
                 <w:szCs w:val="19"/>
                 <w:color w:val="bbbbbb"/>
                 <w:lang w:val="en-US" w:bidi="fa-IR"/>
+                <w:rtl w:val="0"/>
               </w:rPr>
               <w:t xml:space="preserve"> </w:t>
             </w:r>
@@ -11238,6 +11462,7 @@
                 <w:bCs/>
                 <w:color w:val="007020"/>
                 <w:lang w:val="en-US" w:bidi="fa-IR"/>
+                <w:rtl w:val="0"/>
               </w:rPr>
               <w:t>ROLE</w:t>
             </w:r>
@@ -11248,6 +11473,7 @@
                 <w:szCs w:val="19"/>
                 <w:color w:val="bbbbbb"/>
                 <w:lang w:val="en-US" w:bidi="fa-IR"/>
+                <w:rtl w:val="0"/>
               </w:rPr>
               <w:t xml:space="preserve"> </w:t>
             </w:r>
@@ -11258,6 +11484,7 @@
                 <w:szCs w:val="19"/>
                 <w:color w:val="24292E"/>
                 <w:lang w:val="en-US" w:bidi="fa-IR"/>
+                <w:rtl w:val="0"/>
               </w:rPr>
               <w:t>[</w:t>
             </w:r>
@@ -11268,6 +11495,7 @@
                 <w:szCs w:val="19"/>
                 <w:color w:val="24292E"/>
                 <w:lang w:val="en-US" w:bidi="fa-IR"/>
+                <w:rtl w:val="0"/>
               </w:rPr>
               <w:t>db_datareader</w:t>
             </w:r>
@@ -11278,6 +11506,7 @@
                 <w:szCs w:val="19"/>
                 <w:color w:val="24292E"/>
                 <w:lang w:val="en-US" w:bidi="fa-IR"/>
+                <w:rtl w:val="0"/>
               </w:rPr>
               <w:t>]</w:t>
             </w:r>
@@ -11288,6 +11517,7 @@
                 <w:szCs w:val="19"/>
                 <w:color w:val="bbbbbb"/>
                 <w:lang w:val="en-US" w:bidi="fa-IR"/>
+                <w:rtl w:val="0"/>
               </w:rPr>
               <w:t xml:space="preserve"> </w:t>
             </w:r>
@@ -11300,6 +11530,7 @@
                 <w:bCs/>
                 <w:color w:val="007020"/>
                 <w:lang w:val="en-US" w:bidi="fa-IR"/>
+                <w:rtl w:val="0"/>
               </w:rPr>
               <w:t>ADD</w:t>
             </w:r>
@@ -11310,6 +11541,7 @@
                 <w:szCs w:val="19"/>
                 <w:color w:val="bbbbbb"/>
                 <w:lang w:val="en-US" w:bidi="fa-IR"/>
+                <w:rtl w:val="0"/>
               </w:rPr>
               <w:t xml:space="preserve"> </w:t>
             </w:r>
@@ -11320,6 +11552,7 @@
                 <w:szCs w:val="19"/>
                 <w:color w:val="24292E"/>
                 <w:lang w:val="en-US" w:bidi="fa-IR"/>
+                <w:rtl w:val="0"/>
               </w:rPr>
               <w:t>MEMBER</w:t>
             </w:r>
@@ -11330,6 +11563,7 @@
                 <w:szCs w:val="19"/>
                 <w:color w:val="bbbbbb"/>
                 <w:lang w:val="en-US" w:bidi="fa-IR"/>
+                <w:rtl w:val="0"/>
               </w:rPr>
               <w:t xml:space="preserve"> </w:t>
             </w:r>
@@ -11340,6 +11574,7 @@
                 <w:szCs w:val="19"/>
                 <w:color w:val="24292E"/>
                 <w:lang w:val="en-US" w:bidi="fa-IR"/>
+                <w:rtl w:val="0"/>
               </w:rPr>
               <w:t>[</w:t>
             </w:r>
@@ -11350,6 +11585,7 @@
                 <w:szCs w:val="19"/>
                 <w:color w:val="24292E"/>
                 <w:lang w:val="en-US" w:bidi="fa-IR"/>
+                <w:rtl w:val="0"/>
               </w:rPr>
               <w:t>Niloofar</w:t>
             </w:r>
@@ -11360,6 +11596,7 @@
                 <w:szCs w:val="19"/>
                 <w:color w:val="24292E"/>
                 <w:lang w:val="en-US" w:bidi="fa-IR"/>
+                <w:rtl w:val="0"/>
               </w:rPr>
               <w:t>]</w:t>
             </w:r>
@@ -11370,12 +11607,14 @@
                 <w:szCs w:val="19"/>
                 <w:color w:val="24292E"/>
                 <w:lang w:val="en-US" w:bidi="fa-IR"/>
+                <w:rtl w:val="0"/>
               </w:rPr>
               <w:t>;</w:t>
             </w:r>
           </w:p>
           <w:p>
             <w:pPr>
+              <w:bidi w:val="0"/>
               <w:spacing w:before="0" w:after="0" w:line="276" w:lineRule="auto"/>
               <w:jc w:val="left"/>
             </w:pPr>
@@ -11388,6 +11627,7 @@
                 <w:bCs/>
                 <w:color w:val="007020"/>
                 <w:lang w:val="en-US" w:bidi="fa-IR"/>
+                <w:rtl w:val="0"/>
               </w:rPr>
               <w:t>GO</w:t>
             </w:r>
@@ -11406,8 +11646,19 @@
       <w:pgMar w:top="1134" w:right="1134" w:bottom="1134" w:left="1134" w:header="720" w:footer="720" w:gutter="0"/>
       <w:cols w:space="720"/>
       <w:docGrid w:linePitch="360"/>
-      <w:bidi/>
+      <w:bidi w:val="1"/>
     </w:sectPr>
+    <w:bookmarkStart w:id="34232" w:name="پایگاههای-داده-سیستمی-sql-server"/>
+    <w:bookmarkEnd w:id="34232">
+      <w:bookmarkStart w:id="9546" w:name="نقش-database-engine"/>
+      <w:bookmarkEnd w:id="9546"/>
+      <w:bookmarkStart w:id="4475" w:name="نقش-sql-server-agent"/>
+      <w:bookmarkEnd w:id="4475"/>
+      <w:bookmarkStart w:id="46777" w:name="معماری-داخلی-sql-server-database-engine"/>
+      <w:bookmarkEnd w:id="46777"/>
+      <w:bookmarkStart w:id="54879" w:name="مدل-ذهنی-هویت-و-دسترسی"/>
+      <w:bookmarkEnd w:id="54879"/>
+    </w:bookmarkEnd>
   </w:body>
 </w:document>
 </file>
@@ -11776,7 +12027,7 @@
     <w:qFormat/>
     <w:rsid w:val="00FC693F"/>
     <w:pPr>
-      <w:bidi/>
+      <w:bidi w:val="1"/>
       <w:jc w:val="both"/>
     </w:pPr>
     <w:rPr>

</xml_diff>